<commit_message>
Document real product limitations
</commit_message>
<xml_diff>
--- a/docs/TILE-RUSH-QA-TEST-PLAN.docx
+++ b/docs/TILE-RUSH-QA-TEST-PLAN.docx
@@ -1523,7 +1523,27 @@
           <w:spacing w:val="0"/>
           <w:color w:val="0E0E0E"/>
         </w:rPr>
-        <w:t xml:space="preserve">Android room-control and spectator screens still need a final visual pass on a real device.</w:t>
+        <w:t xml:space="preserve">Ultrahuman is single-owner: only the configured </w:t>
+      </w:r>
+      <w:r>
+        <w:rPr>
+          <w:rFonts w:ascii="Menlo" w:hAnsi="Menlo" w:cs="Menlo"/>
+          <w:sz w:val="24"/>
+          <w:sz-cs w:val="24"/>
+          <w:spacing w:val="0"/>
+          <w:color w:val="0E0E0E"/>
+        </w:rPr>
+        <w:t xml:space="preserve">ULTRAHUMAN_USERNAME</w:t>
+      </w:r>
+      <w:r>
+        <w:rPr>
+          <w:rFonts w:ascii="Helvetica" w:hAnsi="Helvetica" w:cs="Helvetica"/>
+          <w:sz w:val="28"/>
+          <w:sz-cs w:val="28"/>
+          <w:spacing w:val="0"/>
+          <w:color w:val="0E0E0E"/>
+        </w:rPr>
+        <w:t xml:space="preserve"> gets ring data.</w:t>
       </w:r>
     </w:p>
     <w:p>
@@ -1552,7 +1572,7 @@
           <w:spacing w:val="0"/>
           <w:color w:val="0E0E0E"/>
         </w:rPr>
-        <w:t xml:space="preserve">Large-screen layout should be checked on the actual mirror/TV.</w:t>
+        <w:t xml:space="preserve">Ring sync happens on Insights/Health requests, not in a background cron.</w:t>
       </w:r>
     </w:p>
     <w:p>
@@ -1581,27 +1601,7 @@
           <w:spacing w:val="0"/>
           <w:color w:val="0E0E0E"/>
         </w:rPr>
-        <w:t xml:space="preserve">Live ring data requires </w:t>
-      </w:r>
-      <w:r>
-        <w:rPr>
-          <w:rFonts w:ascii="Menlo" w:hAnsi="Menlo" w:cs="Menlo"/>
-          <w:sz w:val="24"/>
-          <w:sz-cs w:val="24"/>
-          <w:spacing w:val="0"/>
-          <w:color w:val="0E0E0E"/>
-        </w:rPr>
-        <w:t xml:space="preserve">ULTRAHUMAN_TOKEN</w:t>
-      </w:r>
-      <w:r>
-        <w:rPr>
-          <w:rFonts w:ascii="Helvetica" w:hAnsi="Helvetica" w:cs="Helvetica"/>
-          <w:sz w:val="28"/>
-          <w:sz-cs w:val="28"/>
-          <w:spacing w:val="0"/>
-          <w:color w:val="0E0E0E"/>
-        </w:rPr>
-        <w:t xml:space="preserve">; without it ring values are empty.</w:t>
+        <w:t xml:space="preserve">Solo BPI is recomputed from client-submitted trials; 1v1 scores are server-authoritative.</w:t>
       </w:r>
     </w:p>
     <w:p>
@@ -1630,7 +1630,181 @@
           <w:spacing w:val="0"/>
           <w:color w:val="0E0E0E"/>
         </w:rPr>
-        <w:t xml:space="preserve">APK is a debug build.</w:t>
+        <w:t xml:space="preserve">No password recovery, email, OAuth or 2FA.</w:t>
+      </w:r>
+    </w:p>
+    <w:p>
+      <w:pPr>
+        <w:ind w:left="720" w:first-line="-720"/>
+        <w:spacing w:after="53"/>
+      </w:pPr>
+      <w:r>
+        <w:rPr>
+          <w:rFonts w:ascii="Helvetica" w:hAnsi="Helvetica" w:cs="Helvetica"/>
+          <w:sz w:val="28"/>
+          <w:sz-cs w:val="28"/>
+          <w:color w:val="0E0E0E"/>
+        </w:rPr>
+        <w:t xml:space="preserve"/>
+        <w:tab/>
+        <w:t xml:space="preserve">•</w:t>
+        <w:tab/>
+        <w:t xml:space="preserve"/>
+      </w:r>
+      <w:r>
+        <w:rPr>
+          <w:rFonts w:ascii="Helvetica" w:hAnsi="Helvetica" w:cs="Helvetica"/>
+          <w:sz w:val="28"/>
+          <w:sz-cs w:val="28"/>
+          <w:spacing w:val="0"/>
+          <w:color w:val="0E0E0E"/>
+        </w:rPr>
+        <w:t xml:space="preserve">Emote presets and personal theme are device-local, not synced across devices.</w:t>
+      </w:r>
+    </w:p>
+    <w:p>
+      <w:pPr>
+        <w:ind w:left="720" w:first-line="-720"/>
+        <w:spacing w:after="53"/>
+      </w:pPr>
+      <w:r>
+        <w:rPr>
+          <w:rFonts w:ascii="Helvetica" w:hAnsi="Helvetica" w:cs="Helvetica"/>
+          <w:sz w:val="28"/>
+          <w:sz-cs w:val="28"/>
+          <w:color w:val="0E0E0E"/>
+        </w:rPr>
+        <w:t xml:space="preserve"/>
+        <w:tab/>
+        <w:t xml:space="preserve">•</w:t>
+        <w:tab/>
+        <w:t xml:space="preserve"/>
+      </w:r>
+      <w:r>
+        <w:rPr>
+          <w:rFonts w:ascii="Helvetica" w:hAnsi="Helvetica" w:cs="Helvetica"/>
+          <w:sz w:val="28"/>
+          <w:sz-cs w:val="28"/>
+          <w:spacing w:val="0"/>
+          <w:color w:val="0E0E0E"/>
+        </w:rPr>
+        <w:t xml:space="preserve">Spectator mode is live-only, read-only and capped at 20.</w:t>
+      </w:r>
+    </w:p>
+    <w:p>
+      <w:pPr>
+        <w:ind w:left="720" w:first-line="-720"/>
+        <w:spacing w:after="53"/>
+      </w:pPr>
+      <w:r>
+        <w:rPr>
+          <w:rFonts w:ascii="Helvetica" w:hAnsi="Helvetica" w:cs="Helvetica"/>
+          <w:sz w:val="28"/>
+          <w:sz-cs w:val="28"/>
+          <w:color w:val="0E0E0E"/>
+        </w:rPr>
+        <w:t xml:space="preserve"/>
+        <w:tab/>
+        <w:t xml:space="preserve">•</w:t>
+        <w:tab/>
+        <w:t xml:space="preserve"/>
+      </w:r>
+      <w:r>
+        <w:rPr>
+          <w:rFonts w:ascii="Helvetica" w:hAnsi="Helvetica" w:cs="Helvetica"/>
+          <w:sz w:val="28"/>
+          <w:sz-cs w:val="28"/>
+          <w:spacing w:val="0"/>
+          <w:color w:val="0E0E0E"/>
+        </w:rPr>
+        <w:t xml:space="preserve">The Ask helper is rule-based, not an LLM or medical advice.</w:t>
+      </w:r>
+    </w:p>
+    <w:p>
+      <w:pPr>
+        <w:ind w:left="720" w:first-line="-720"/>
+        <w:spacing w:after="53"/>
+      </w:pPr>
+      <w:r>
+        <w:rPr>
+          <w:rFonts w:ascii="Helvetica" w:hAnsi="Helvetica" w:cs="Helvetica"/>
+          <w:sz w:val="28"/>
+          <w:sz-cs w:val="28"/>
+          <w:color w:val="0E0E0E"/>
+        </w:rPr>
+        <w:t xml:space="preserve"/>
+        <w:tab/>
+        <w:t xml:space="preserve">•</w:t>
+        <w:tab/>
+        <w:t xml:space="preserve"/>
+      </w:r>
+      <w:r>
+        <w:rPr>
+          <w:rFonts w:ascii="Helvetica" w:hAnsi="Helvetica" w:cs="Helvetica"/>
+          <w:sz w:val="28"/>
+          <w:sz-cs w:val="28"/>
+          <w:spacing w:val="0"/>
+          <w:color w:val="0E0E0E"/>
+        </w:rPr>
+        <w:t xml:space="preserve">Android is a debug APK, min SDK 26, portrait-locked; no Play Store release or iOS app.</w:t>
+      </w:r>
+    </w:p>
+    <w:p>
+      <w:pPr>
+        <w:ind w:left="720" w:first-line="-720"/>
+        <w:spacing w:after="53"/>
+      </w:pPr>
+      <w:r>
+        <w:rPr>
+          <w:rFonts w:ascii="Helvetica" w:hAnsi="Helvetica" w:cs="Helvetica"/>
+          <w:sz w:val="28"/>
+          <w:sz-cs w:val="28"/>
+          <w:color w:val="0E0E0E"/>
+        </w:rPr>
+        <w:t xml:space="preserve"/>
+        <w:tab/>
+        <w:t xml:space="preserve">•</w:t>
+        <w:tab/>
+        <w:t xml:space="preserve"/>
+      </w:r>
+      <w:r>
+        <w:rPr>
+          <w:rFonts w:ascii="Helvetica" w:hAnsi="Helvetica" w:cs="Helvetica"/>
+          <w:sz w:val="28"/>
+          <w:sz-cs w:val="28"/>
+          <w:spacing w:val="0"/>
+          <w:color w:val="0E0E0E"/>
+        </w:rPr>
+        <w:t xml:space="preserve">Large-screen layouts are responsive CSS, not a dedicated TV/kiosk mode.</w:t>
+      </w:r>
+    </w:p>
+    <w:p>
+      <w:pPr>
+        <w:ind w:left="720" w:first-line="-720"/>
+        <w:spacing w:after="53"/>
+      </w:pPr>
+      <w:r>
+        <w:rPr>
+          <w:rFonts w:ascii="Helvetica" w:hAnsi="Helvetica" w:cs="Helvetica"/>
+          <w:sz w:val="28"/>
+          <w:sz-cs w:val="28"/>
+          <w:color w:val="0E0E0E"/>
+        </w:rPr>
+        <w:t xml:space="preserve"/>
+        <w:tab/>
+        <w:t xml:space="preserve">•</w:t>
+        <w:tab/>
+        <w:t xml:space="preserve"/>
+      </w:r>
+      <w:r>
+        <w:rPr>
+          <w:rFonts w:ascii="Helvetica" w:hAnsi="Helvetica" w:cs="Helvetica"/>
+          <w:sz w:val="28"/>
+          <w:sz-cs w:val="28"/>
+          <w:spacing w:val="0"/>
+          <w:color w:val="0E0E0E"/>
+        </w:rPr>
+        <w:t xml:space="preserve">QA is manual; there is no automated E2E suite.</w:t>
       </w:r>
     </w:p>
     <w:p>

</xml_diff>